<commit_message>
Apply Doc 1's edit patterns to Docs 2-5
Same treatment across all four: cut preview sentences, redundant
closing summaries, meta-instructions about how a finding should be
cited elsewhere, and the one self-congratulatory sentence about the
document's own honesty. Replaced roughly 25 bracket-style cross-doc
citations with plain in-prose references. Open questions resolved the
same way as Doc 1: kept the "Open and untested" section in every
document, kept the cut identification-rigor content cut.

Co-Authored-By: Claude Sonnet 5 <noreply@anthropic.com>
Claude-Session: https://claude.ai/code/session_01T6UzmRkyqYD2WcKRzWtaQa
</commit_message>
<xml_diff>
--- a/40_DOCS/Doc_2_Player_Pillar_I.docx
+++ b/40_DOCS/Doc_2_Player_Pillar_I.docx
@@ -17,7 +17,7 @@
         <w:jc w:val="left"/>
       </w:pPr>
       <w:r>
-        <w:t xml:space="preserve">This document covers how a player's future gets built: the data underneath every valuation, the trailing baseline that estimates current form, the aging curve that projects it forward, and the exit hazard that prices the chance a career ends before a projected season arrives. Each later document assumes what is described here.</w:t>
+        <w:t xml:space="preserve">This document covers how a player's future gets built: the data behind every valuation, the trailing baseline, the aging curve, and the exit hazard.</w:t>
       </w:r>
     </w:p>
     <w:p>
@@ -35,7 +35,7 @@
         <w:jc w:val="left"/>
       </w:pPr>
       <w:r>
-        <w:t xml:space="preserve">Four source datasets feed the model. A commercial contract database (PuckPedia) supplies each NHL contract's terms and a trade ledger. Player production comes from one published wins-above-replacement model (Patrick Bacon, hockeystats.com), used as the model's single value provider throughout. Trade-protection clause status, absent from the contract database, comes from a separate scrape. A self-built game-level database, covering 11,870 games from 2017-18 through 2025-26, supplies the independent Game Value metric described in Doc 1.</w:t>
+        <w:t xml:space="preserve">Four source datasets feed the model. A commercial contract database (PuckPedia) supplies each NHL contract's terms and a trade ledger. Player production comes from one published wins-above-replacement model (Patrick Bacon, hockeystats.com), used as the model's single value provider throughout. Trade-protection clause status, absent from the contract database, comes from a separate scrape. A self-built game-level database, covering 11,870 games from 2017-18 through 2025-26, supplies the independent Game Value metric described in the circularity document.</w:t>
       </w:r>
     </w:p>
     <w:p>
@@ -74,16 +74,16 @@
         <w:t xml:space="preserve">nhl_id</w:t>
       </w:r>
       <w:r>
-        <w:t xml:space="preserve"> routes a player into the Game Value tables, which key on the NHL's own identifiers rather than PuckPedia's. Three keys exist rather than one because the sources were never built to talk to each other; each key is the one that actually survives the join to its source.</w:t>
-      </w:r>
-    </w:p>
-    <w:p>
-      <w:pPr>
-        <w:spacing w:after="200"/>
-        <w:jc w:val="left"/>
-      </w:pPr>
-      <w:r>
-        <w:t xml:space="preserve">The trade ledger records 980 export rows, which collapse into 946 distinct trade events. The gap between those two numbers is the three-team facilitation mechanic: the NHL does not permit a genuine three-team trade, so what looks like one is actually two paired two-team deals executed together, and the export carries a row for each leg. Time coverage starts in 2018, which is a data-availability limit in the source export, not a design choice; contract counts thin sharply before it (see Doc 3, §3.2).</w:t>
+        <w:t xml:space="preserve"> routes a player into the Game Value tables, which key on the NHL's own identifiers rather than PuckPedia's. The sources were never built to talk to each other, so three keys exist instead of one: each key is used because it happens to be the identifier that two particular sources actually share.</w:t>
+      </w:r>
+    </w:p>
+    <w:p>
+      <w:pPr>
+        <w:spacing w:after="200"/>
+        <w:jc w:val="left"/>
+      </w:pPr>
+      <w:r>
+        <w:t xml:space="preserve">The trade ledger records 980 export rows, which collapse into 946 distinct trade events. The gap between those two numbers is the three-team facilitation mechanic: the NHL does not permit a genuine three-team trade, so what looks like one is actually two paired two-team deals executed together, and the export carries a row for each leg. Time coverage starts in 2018, which is a data-availability limit in the source export, not a design choice; contract counts thin sharply before it.</w:t>
       </w:r>
     </w:p>
     <w:p>
@@ -145,7 +145,7 @@
         <w:t xml:space="preserve">nhl_id</w:t>
       </w:r>
       <w:r>
-        <w:t xml:space="preserve"> pollution: 23 IDs, 217 rows, and 47 players affected before correction. The correction is in place, and it is documented here rather than left silent.</w:t>
+        <w:t xml:space="preserve"> pollution: 23 IDs, 217 rows, and 47 players affected before correction. The correction is in place.</w:t>
       </w:r>
     </w:p>
     <w:p>
@@ -224,7 +224,7 @@
         <w:jc w:val="left"/>
       </w:pPr>
       <w:r>
-        <w:t xml:space="preserve">The blend is one weighted average: lambda applied to the player's own smoothed level, plus one minus lambda applied to the age-and-style comparable norm. Lambda was estimated by player-split cross-validation at 0.55, and it was re-confirmed rather than carried forward on trust after the curve rebuild that followed the Stage 3 rate change (Doc 3, §3.2).</w:t>
+        <w:t xml:space="preserve">The blend is one weighted average: lambda applied to the player's own smoothed level, plus one minus lambda applied to the age-and-style comparable norm. Lambda was estimated by player-split cross-validation at 0.55, and it was re-confirmed rather than carried forward on trust after the curve was rebuilt on the current market rate.</w:t>
       </w:r>
     </w:p>
     <w:p>
@@ -242,7 +242,7 @@
         <w:jc w:val="left"/>
       </w:pPr>
       <w:r>
-        <w:t xml:space="preserve">The 60/40 trailing weight is not cross-validated. A 50/30/20 alternative beats it in each bootstrap resample tested, and it has not been adopted. Adopting it would require building a fallback ladder for players with less history, re-cross-validating lambda jointly with the new weight, and refitting the NPV spines plus the hardcoded constants in the draft-curve script, so this is a real piece of follow-on work, not a small tweak.</w:t>
+        <w:t xml:space="preserve">The 60/40 trailing weight is not cross-validated. A 50/30/20 alternative beats it in each bootstrap resample tested, and it has not been adopted. Adopting it would require building a fallback ladder for players with less history, re-cross-validating lambda jointly with the new weight, and refitting the NPV spines plus the hardcoded constants in the draft-curve script.</w:t>
       </w:r>
     </w:p>
     <w:p>
@@ -306,7 +306,16 @@
         <w:jc w:val="left"/>
       </w:pPr>
       <w:r>
-        <w:t xml:space="preserve">The curve is built from within-player change, meaning it tracks the same player's own season-over-season movement, rather than a cross-sectional comparison of, for example, the average 25-year-old against the average 26-year-old treated as two separate groups. That distinction is a survivorship defence, not a technicality: if weaker players tend to leave the league by 26, the average 26-year-old will look better than any individual 25-year-old actually became, purely from who dropped out of the sample. A within-player trajectory requires the same player to appear in both seasons, so the curve says nothing about the players who did not, players who left the league; that margin is priced separately by the exit hazard (below). What neither component reaches is a player whose production collapses but who stays in the league, covered next.</w:t>
+        <w:t xml:space="preserve">The curve is built from within-player change, meaning it tracks the same player's own season-over-season movement, rather than a cross-sectional comparison of, for example, the average 25-year-old against the average 26-year-old treated as two separate groups. That distinction is a survivorship defence, not a technicality: if weaker players tend to leave the league by 26, the average 26-year-old will look better than any individual 25-year-old actually became, purely from who dropped out of the sample.</w:t>
+      </w:r>
+    </w:p>
+    <w:p>
+      <w:pPr>
+        <w:spacing w:after="200"/>
+        <w:jc w:val="left"/>
+      </w:pPr>
+      <w:r>
+        <w:t xml:space="preserve">A within-player trajectory requires the same player to appear in both seasons, so the curve says nothing about the players who did not, players who left the league. That margin is priced separately by the exit hazard, below. One case neither piece covers is a player whose production collapses but who stays in the league, covered next.</w:t>
       </w:r>
     </w:p>
     <w:p>
@@ -342,7 +351,7 @@
         <w:jc w:val="left"/>
       </w:pPr>
       <w:r>
-        <w:t xml:space="preserve">Three approaches were tested. The first attempt froze any weak baseline flat, holding anything below a low threshold at its current level rather than projecting it; this was rejected because it discarded information for players with mildly positive but still low production, who received no aging treatment for no principled reason. The second attempt reflected the curve, applying the aging multiplier in reverse for negative baselines, so a declining curve pushed an already-struggling player further down. This beat the freeze approach at a one-year horizon by roughly 2%, but it inverted at longer horizons, running 4% to 8% worse than freezing by the third year out. Testing this approach produced a finding worth keeping on its own: among below-replacement players who stayed in the league, 93% improved the next season and 81% finished back above replacement, with the group average moving from roughly −0.22 to +0.32 wins.</w:t>
+        <w:t xml:space="preserve">Three approaches were tested. The first attempt froze any weak baseline flat, holding anything below a low threshold at its current level rather than projecting it; this was rejected because it discarded information for players with mildly positive but still low production, who received no aging treatment for no principled reason. The second attempt reflected the curve, applying the aging multiplier in reverse for negative baselines, so a declining curve pushed an already-struggling player further down. This beat the freeze approach at a one-year horizon by roughly 2%, but it inverted at longer horizons, running 4% to 8% worse than freezing by the third year out. Among below-replacement players who stayed in the league, 93% improved the next season and 81% finished back above replacement, with the group average moving from roughly −0.22 to +0.32 wins.</w:t>
       </w:r>
     </w:p>
     <w:p>
@@ -369,16 +378,16 @@
         <w:jc w:val="left"/>
       </w:pPr>
       <w:r>
-        <w:t xml:space="preserve">The guard rail on the projection multiplier exists on one side only. The upper multiplier is capped at +200%, but there is no lower bound. When a curve's starting level sits near zero, multipliers can go negative: 418 of 1,097 cases in synthetic testing, the most extreme at −5.98, which asserts a player will produce six times his output in the opposite direction. Live exposure in the actual contract panel is smaller but real: 67 contract-seasons across 41 contracts, with the worst real case at −1.61, concentrated in exactly the below-replacement population the back-test depends on. This is known and unfixed, and it belongs in any write-up rather than left for a reader to find.</w:t>
-      </w:r>
-    </w:p>
-    <w:p>
-      <w:pPr>
-        <w:spacing w:after="200"/>
-        <w:jc w:val="left"/>
-      </w:pPr>
-      <w:r>
-        <w:t xml:space="preserve">The curve is fit on the full panel, including seasons after any given valuation date. The identification consequences of this are addressed in Doc 5, §5.1.</w:t>
+        <w:t xml:space="preserve">The guard rail on the projection multiplier exists on one side only. The upper multiplier is capped at +200%, but there is no lower bound. When a curve's starting level sits near zero, multipliers can go negative: 418 of 1,097 cases in synthetic testing, the most extreme at −5.98, which asserts a player will produce six times his output in the opposite direction. Live exposure in the actual contract panel is smaller but real: 67 contract-seasons across 41 contracts, with the worst real case at −1.61, concentrated in exactly the below-replacement population the back-test depends on. This is known and unfixed.</w:t>
+      </w:r>
+    </w:p>
+    <w:p>
+      <w:pPr>
+        <w:spacing w:after="200"/>
+        <w:jc w:val="left"/>
+      </w:pPr>
+      <w:r>
+        <w:t xml:space="preserve">The curve is fit on the full panel, including seasons after any given valuation date. This is picked up again in the document on identification threats.</w:t>
       </w:r>
     </w:p>
     <w:p>
@@ -405,16 +414,16 @@
         <w:jc w:val="left"/>
       </w:pPr>
       <w:r>
-        <w:t xml:space="preserve">Four quality tiers, defined by trailing wins above replacement, structure the hazard table: star at 3 wins or more, regular between 1 and 3, fringe between 0 and 1, and below-replacement under 0. These bands are project-defined and interpretable rather than fitted or statistically optimized, chosen for legibility over precision. The same tiers are also used in the RFA retention gate (Doc 3, §3.1), and that consistency matters because it means the same definition of player quality governs both when the model expects a career to end and when it expects a club to walk away from a player.</w:t>
-      </w:r>
-    </w:p>
-    <w:p>
-      <w:pPr>
-        <w:spacing w:after="200"/>
-        <w:jc w:val="left"/>
-      </w:pPr>
-      <w:r>
-        <w:t xml:space="preserve">Observed exit rates by tier show the pattern a hockey-literate reader would expect: established players, meaning stars and regulars, exit the league at close to 1% a year. Marginal players, fringe and below-replacement, exit at 10% to 19% a year. The hazard compounds sharply for any player past his mid-thirties, regardless of tier.</w:t>
+        <w:t xml:space="preserve">Four quality tiers, defined by trailing wins above replacement, structure the hazard table: star at 3 wins or more, regular between 1 and 3, fringe between 0 and 1, and below-replacement under 0. These bands are project-defined and interpretable rather than fitted or statistically optimized, chosen for legibility over precision. The same tiers are also used to decide whether a club is expected to extend a qualifying offer to an RFA, and that consistency matters: the same definition of player quality governs both when the model expects a career to end and when it expects a club to walk away from a player.</w:t>
+      </w:r>
+    </w:p>
+    <w:p>
+      <w:pPr>
+        <w:spacing w:after="200"/>
+        <w:jc w:val="left"/>
+      </w:pPr>
+      <w:r>
+        <w:t xml:space="preserve">Observed exit rates by tier: established players, meaning stars and regulars, exit the league at close to 1% a year. Marginal players, fringe and below-replacement, exit at 10% to 19% a year. The hazard compounds sharply for any player past his mid-thirties, regardless of tier.</w:t>
       </w:r>
     </w:p>
     <w:p>
@@ -441,7 +450,7 @@
         <w:jc w:val="left"/>
       </w:pPr>
       <w:r>
-        <w:t xml:space="preserve">A different star threshold, 3.5 wins rather than 3, is used in the exploratory star-and-RFA analysis in Doc 5, §5.2, and that threshold is logged as arbitrary and unswept there. The project currently runs on two different star definitions at once, and any document using either one should say which.</w:t>
+        <w:t xml:space="preserve">A different star threshold, 3.5 wins rather than 3, is used in a separate exploratory analysis of star players and restricted free agency, and that threshold is arbitrary and unswept there. The project currently uses two different star definitions.</w:t>
       </w:r>
     </w:p>
     <w:p>

</xml_diff>